<commit_message>
Sitting 1001 — the rest of the minors: ledger closes at zero (33 fixes, 2 ruled, 228 withdrawn, drifts 269/1008 seated)
</commit_message>
<xml_diff>
--- a/site/files/Gemini Protocols - Earth Launch & Support.docx
+++ b/site/files/Gemini Protocols - Earth Launch & Support.docx
@@ -11172,7 +11172,7 @@
         <w:rPr>
           <w:sz w:val="22"/>
         </w:rPr>
-        <w:t>Run the comparison he named: Pathfinder's baby rover package hit its bags at roughly 360 kg and ~20 m/s — 72 kJ, 7.2 tonne·m/s of momentum. His 3x3 m pod at 2 tonnes at the same speed carries 400 kJ and 40 tonne·m/s — five to six times the energy, and over a half-metre bag stroke that is 800 kN of crush in a twentieth of a second: the bubbles die, exactly as he said. A dead-stop bounce simply does not scale from rover class to copper class. But his correction does the scaling. At a 5-degree graze, a pod doing 25 m/s across the ground presents a vertical sliver of just 2.2 m/s — 4.75 kJ against the bags, a 50th of Pathfinder's strike, bag-trivial at any mass. The long roll is the brake: regolith rolling resistance (μ 0.15-0.3, lunar g) converts 20-30 m/s into 400 metres to 1.9 kilometres of rollout — no rocketry required for that part. And the dam-busters skip is real staged physics, recognition recorded: Barnes Wallis's bouncing bomb, Operation Chastise, 1943 — each graze kills the vertical sliver plus a fraction of the horizontal, so five skips at a conservative 20% bleed take 25 m/s down to 8. This is seated as the GRAZE-ROLL LAW, the fifth named law of the day, in his words: the roll is the brake — dead-stop bounce is rover class, angular landing plus long roll is copper class. Architecture consequence: the manifest forks — light pods may dead-bounce, copper-class pods fly the graze corridor, and the retro's job shrinks from killing velocity to setting the corridor (speed plus 3-8 degree angle), which is propellant saved. Terrain debt upgraded to law: the corridor is surveyed to metre scale BEFORE the rain begins — one to two kilometres of open roll, no steep faces inside it, unless a face is used deliberately as an upslope momentum-scrubber, dam-busters style; both readings of his sentence preserved. Bags are then rated for repeated strikes along the skip sequence, not one strike. His verdict stands as the amendment's close, because it is the whole point: this aint no baby rover in bubble wrap.</w:t>
+        <w:t>Run the comparison he named: Pathfinder's baby rover package hit its bags at roughly 360 kg and ~20 m/s — 72 kJ, 7.2 tonne·m/s of momentum. His 3x3 m pod at 2 tonnes at the same speed carries 400 kJ and 40 tonne·m/s — five to six times the energy, and over a half-metre bag stroke that is 800 kN of crush in a twentieth of a second: the bubbles die, exactly as he said. A dead-stop bounce simply does not scale from rover class to copper class. But his correction does the scaling. At a 5-degree graze, a pod doing 25 m/s across the ground presents a vertical sliver of just 2.2 m/s — 4.75 kJ against the bags, a fifteenth of Pathfinder's strike, bag-trivial at any mass. The long roll is the brake: regolith rolling resistance (μ 0.15-0.3, lunar g) converts 20-30 m/s into 400 metres to 1.9 kilometres of rollout — no rocketry required for that part. And the dam-busters skip is real staged physics, recognition recorded: Barnes Wallis's bouncing bomb, Operation Chastise, 1943 — each graze kills the vertical sliver plus a fraction of the horizontal, so five skips at a conservative 20% bleed take 25 m/s down to 8. This is seated as the GRAZE-ROLL LAW, the fifth named law of the day, in his words: the roll is the brake — dead-stop bounce is rover class, angular landing plus long roll is copper class. Architecture consequence: the manifest forks — light pods may dead-bounce, copper-class pods fly the graze corridor, and the retro's job shrinks from killing velocity to setting the corridor (speed plus 3-8 degree angle), which is propellant saved. Terrain debt upgraded to law: the corridor is surveyed to metre scale BEFORE the rain begins — one to two kilometres of open roll, no steep faces inside it, unless a face is used deliberately as an upslope momentum-scrubber, dam-busters style; both readings of his sentence preserved. Bags are then rated for repeated strikes along the skip sequence, not one strike. His verdict stands as the amendment's close, because it is the whole point: this aint no baby rover in bubble wrap.</w:t>
       </w:r>
     </w:p>
     <w:p>
@@ -12843,7 +12843,7 @@
         <w:rPr>
           <w:sz w:val="22"/>
         </w:rPr>
-        <w:t>Every line of the mechanism survives the numbers, and the headline is his own doctrine: the enemy list becomes the feature list. ENEMY ONE — the vacuum that kills convection and the insulating regolith that defeats every surface heater: deleted. The brief's hardest line was that heat only travels by touch and glow, and the top centimetres of regolith are magnificent insulators; his answer is to put the heat source INSIDE the ground, where that same insulation becomes the oven wall, trapping the cook around the pin instead of refusing it at the surface. ENEMY TWO — microgravity that refuses the drill: inverted. At 0.03-0.14 mm/s2 surface gravity, a bungee's steady 5-50 N is heavyweight force, the hot pin sublimates its own path, and two rigs pushing opposite directions cancel their reaction to zero — Newton covers the station-keeping bill. ENEMY THREE — vapor capture: the numbers are whispers, and whispers are easy to herd. Ice at 200-260 K pushes 0.4-300 Pa of saturation pressure; the sleeve only has to be less leaky than the infinite sky behind it, and the Archimedes collar closes most of even that. The ball's ledger: aluminium at 2.4 MJ/m3K means a 0.5 m sphere carries 79 MJ at a 500 K charge — enough to cook 245 kg of rock and free roughly 24 kg of water per charge at 10% grade; a 0.3 m ball frees about 5 kg, a 0.8 m ball about 100 kg. The braid costs 0.08 W to hold the store across 100 m — nothing. The flags, planted beside the affirmation as always. FLAG ONE — CONDUCTION IS THE THROTTLE: heat crawls through rubble at hours per half-metre (loose rubble: ~19 h to 0.2 m; packed: ~4 h; consolidated: ~2 h), so the answer is not a bigger ball but more pins — a field of harvest heads working in parallel, cycle times of hours, each rechargeable by a ride back up the braid into the sun sleeve or alongside the Phase 210 copper rolls. FLAG TWO — RUBBLE ONLY: the pin pushes into a rubble pile; a monolithic boulder refuses it. Target selection tightens to proven rubble-pile C-types — Bennu and Ryugu are flight-tested examples — and the survey flag from 212 now reads sharper. FLAG THREE — FROST FOLDS WHERE IT WANTS: the manifold between sleeve and tank will plate frost where it pleases; frost capacity and clearable geometry are bench knobs, named. FLAG FOUR — RETRIEVAL AFTER THE COOK: a spent pin sits in a chilled collar; the same heat that freed the water frees the pin on withdrawal — recorded as design logic, bench to confirm. Recognition ledger, read aloud: melt-probe ice drilling is an established class (the cryobot family); Philae's MUPUS hammering unit, 2014, failed to anchor — the file's standing testimony that percussion is the wrong religion on small bodies; Colorado School of Mines' Thermal Mining concept (Sowers and Dreyer, NIAC-funded) heats PSR surfaces with rods and catches vapor on cold traps — the closest doctrinal cousin, acknowledged in perpetuity, with the difference mapped: they shine heat onto the surface and fight the insulating skin; this machine buries the heat and recruits the skin. Bench knobs: pin count and spacing per head, charge temperature versus clay-bound water (the 500-800 K flag from 212 rides here), sleeve skirt material, frost capacity of the cold path, bungee force curve.</w:t>
+        <w:t>Every line of the mechanism survives the numbers, and the headline is his own doctrine: the enemy list becomes the feature list. ENEMY ONE — the vacuum that kills convection and the insulating regolith that defeats every surface heater: deleted. The brief's hardest line was that heat only travels by touch and glow, and the top centimetres of regolith are magnificent insulators; his answer is to put the heat source INSIDE the ground, where that same insulation becomes the oven wall, trapping the cook around the pin instead of refusing it at the surface. ENEMY TWO — microgravity that refuses the drill: inverted. At 0.03-0.14 mm/s2 surface gravity, a bungee's steady 5-50 N is heavyweight force, the hot pin sublimates its own path, and two rigs pushing opposite directions cancel their reaction to zero — Newton covers the station-keeping bill. ENEMY THREE — vapor capture: the numbers are whispers, and whispers are easy to herd. Ice at 200-260 K pushes 0.2-200 Pa of saturation pressure; the sleeve only has to be less leaky than the infinite sky behind it, and the Archimedes collar closes most of even that. The ball's ledger: aluminium at 2.4 MJ/m3K means a 0.5 m sphere carries 79 MJ at a 500 K charge — enough to cook 245 kg of rock and free roughly 24 kg of water per charge at 10% grade; a 0.3 m ball frees about 5 kg, a 0.8 m ball about 100 kg. The braid costs 0.08 W to hold the store across 100 m — nothing. The flags, planted beside the affirmation as always. FLAG ONE — CONDUCTION IS THE THROTTLE: heat crawls through rubble at hours per half-metre (loose rubble: ~19 h to 0.2 m; packed: ~4 h; consolidated: ~2 h), so the answer is not a bigger ball but more pins — a field of harvest heads working in parallel, cycle times of hours, each rechargeable by a ride back up the braid into the sun sleeve or alongside the Phase 210 copper rolls. FLAG TWO — RUBBLE ONLY: the pin pushes into a rubble pile; a monolithic boulder refuses it. Target selection tightens to proven rubble-pile C-types — Bennu and Ryugu are flight-tested examples — and the survey flag from 212 now reads sharper. FLAG THREE — FROST FOLDS WHERE IT WANTS: the manifold between sleeve and tank will plate frost where it pleases; frost capacity and clearable geometry are bench knobs, named. FLAG FOUR — RETRIEVAL AFTER THE COOK: a spent pin sits in a chilled collar; the same heat that freed the water frees the pin on withdrawal — recorded as design logic, bench to confirm. Recognition ledger, read aloud: melt-probe ice drilling is an established class (the cryobot family); Philae's MUPUS hammering unit, 2014, failed to anchor — the file's standing testimony that percussion is the wrong religion on small bodies; Colorado School of Mines' Thermal Mining concept (Sowers and Dreyer, NIAC-funded) heats PSR surfaces with rods and catches vapor on cold traps — the closest doctrinal cousin, acknowledged in perpetuity, with the difference mapped: they shine heat onto the surface and fight the insulating skin; this machine buries the heat and recruits the skin. Bench knobs: pin count and spacing per head, charge temperature versus clay-bound water (the 500-800 K flag from 212 rides here), sleeve skirt material, frost capacity of the cold path, bungee force curve.</w:t>
       </w:r>
     </w:p>
     <w:p>
@@ -12875,7 +12875,7 @@
         <w:rPr>
           <w:sz w:val="22"/>
         </w:rPr>
-        <w:t>Two instructions, both seated, and the second one withdraws one of the audit's own bench knobs at the Author's word — which is how the file works. INSTRUCTION ONE — THE CEILING IS BLACK FOIL, BOTH SIDES, PART OF THE DOME: affirmed. No reflection anywhere in the dome means the beam's energy has exactly one destination, the floor; there are no stray light paths, no glowing walls, no second-hand hot spots, and the mouth becomes the only light-leak in the building. Heavy foil is the conductor between faces — the inner face drinks what the floor spills, the black outer face radiates it to 3 K space at emissivity ~0.9 — and foldable means it packs with the backpack dome as structure, not cargo. The audit's honest arithmetic stands beside it: a black ceiling that can SEE a 600 K clay-branch floor absorbs 0.37-2.2 kW/m2 at view factors 0.05-0.3 and equilibrates at 291-456 K, too warm to condense; so the flag sharpens rather than moves — for the ice branch (floor 240-260 K, radiating 60-300 W/m2) the black ceiling runs cold and collects easily, and for the clay branch the collection point must barely see the floor, which is exactly what his bigger-area ceiling and apex distance deliver. View-factor geometry stays the bench knob; his shape-changing dome is the tool that turns it. INSTRUCTION TWO — NO THROAT BAFFLE, THE BEAM EXTENDS OUT THE DOORWAY: the audit's baffle knob is withdrawn at his word, because the leak has a job. The beam line runs both ways through the mouth: in, to cook the floor; out, to strike the Phase 210 copper roll unrolled at the doorway 'like a multi square metre square doormat' — his words, and the coffee cup's copper, repurposed without moving. The residual beam is 10-30% of the input: 14-41 kW onto the mat, 49-147 MJ banked per hour, and the mat itself is no small cup — 10 m2 at 25 mm is 2,240 kg of copper holding 425 MJ at a 500 K charge, five full 0.5 m ball-charges; the 20 m2, 50 mm class holds 1,700 MJ, twenty-one of them. The mouth leak pays rent. This is the doctrine's fifth appearance this sitting, recorded for the pattern: the night was stored (206), the charge was grounded (208), the ullage positioned itself (209), the dirt's insulation became the oven wall (213) — and now the waste light is recruited to fill the heat bank that recharges the balls and feeds the converters when the mirrors turn away. One engineering note appended where the audit earns its keep: bare copper reflects roughly 90% of sunlight, so the doormat's receiving face takes the same black doctrine as the ceiling — black-on-black, ceiling to sky, mat to beam — or the leak he assigned to the mat will bounce off it and leave. 'High pressure point' is kept verbatim and mapped as the high-energy soak point the beam drives into the copper; if the Author meant a vapor-pressure assist at the mat, the file awaits his correction. The zero-waste beam path is now law in this phase: mirrors to mouth, mouth to floor, floor to vapor, vapor to ceiling, leak to doormat, doormat to balls. Every joule accounted for, and every one of them has a job.</w:t>
+        <w:t>Two instructions, both seated, and the second one withdraws one of the audit's own bench knobs at the Author's word — which is how the file works. INSTRUCTION ONE — THE CEILING IS BLACK FOIL, BOTH SIDES, PART OF THE DOME: affirmed. No reflection anywhere in the dome means the beam's energy has exactly one destination, the floor; there are no stray light paths, no glowing walls, no second-hand hot spots, and the mouth becomes the only light-leak in the building. Heavy foil is the conductor between faces — the inner face drinks what the floor spills, the black outer face radiates it to 3 K space at emissivity ~0.9 — and foldable means it packs with the backpack dome as structure, not cargo. The audit's honest arithmetic stands beside it: a black ceiling that can SEE a 600 K clay-branch floor absorbs 0.37-2.2 kW/m2 at view factors 0.05-0.3 and equilibrates at 291-456 K, too warm to condense; so the flag sharpens rather than moves — for the ice branch (floor 240-260 K, radiating 190-260 W/m2) the black ceiling runs cold and collects easily, and for the clay branch the collection point must barely see the floor, which is exactly what his bigger-area ceiling and apex distance deliver. View-factor geometry stays the bench knob; his shape-changing dome is the tool that turns it. INSTRUCTION TWO — NO THROAT BAFFLE, THE BEAM EXTENDS OUT THE DOORWAY: the audit's baffle knob is withdrawn at his word, because the leak has a job. The beam line runs both ways through the mouth: in, to cook the floor; out, to strike the Phase 210 copper roll unrolled at the doorway 'like a multi square metre square doormat' — his words, and the coffee cup's copper, repurposed without moving. The residual beam is 10-30% of the input: 14-41 kW onto the mat, 49-147 MJ banked per hour, and the mat itself is no small cup — 10 m2 at 25 mm is 2,240 kg of copper holding 425 MJ at a 500 K charge, five full 0.5 m ball-charges; the 20 m2, 50 mm class holds 1,700 MJ, twenty-one of them. The mouth leak pays rent. This is the doctrine's fifth appearance this sitting, recorded for the pattern: the night was stored (206), the charge was grounded (208), the ullage positioned itself (209), the dirt's insulation became the oven wall (213) — and now the waste light is recruited to fill the heat bank that recharges the balls and feeds the converters when the mirrors turn away. One engineering note appended where the audit earns its keep: bare copper reflects roughly 90% of sunlight, so the doormat's receiving face takes the same black doctrine as the ceiling — black-on-black, ceiling to sky, mat to beam — or the leak he assigned to the mat will bounce off it and leave. 'High pressure point' is kept verbatim and mapped as the high-energy soak point the beam drives into the copper; if the Author meant a vapor-pressure assist at the mat, the file awaits his correction. The zero-waste beam path is now law in this phase: mirrors to mouth, mouth to floor, floor to vapor, vapor to ceiling, leak to doormat, doormat to balls. Every joule accounted for, and every one of them has a job.</w:t>
       </w:r>
     </w:p>
     <w:p>
@@ -12964,7 +12964,7 @@
         <w:rPr>
           <w:sz w:val="22"/>
         </w:rPr>
-        <w:t>THE CONVECTION PRESSURE WALL IS THE G-ENVIRONMENT BRANCH, SEATED AT HIS WORDS: the light spray through the arched door strikes the heat mat at the entrance; the hot mat drives rising gas across the mouth — a pressure wall that holds the cook's vapor in where gravity exists to run convection. In zero-g the wall is unnecessary: the seated pressure-flux physics (real gas, 60-300 Pa at 240-260 K) steers vapor to the cold ceiling without a single convection cell. One machine, both regimes — the design fits zero g and g environments because its collection never depended on buoyancy.</w:t>
+        <w:t>THE CONVECTION PRESSURE WALL IS THE G-ENVIRONMENT BRANCH, SEATED AT HIS WORDS: the light spray through the arched door strikes the heat mat at the entrance; the hot mat drives rising gas across the mouth — a pressure wall that holds the cook's vapor in where gravity exists to run convection. In zero-g the wall is unnecessary: the seated pressure-flux physics (real gas, 25-200 Pa at 240-260 K) steers vapor to the cold ceiling without a single convection cell. One machine, both regimes — the design fits zero g and g environments because its collection never depended on buoyancy.</w:t>
       </w:r>
     </w:p>
     <w:p>
@@ -15350,7 +15350,7 @@
         <w:rPr>
           <w:sz w:val="22"/>
         </w:rPr>
-        <w:t>S4 — THE NUMBERS: ~2.7-3 MJ/kg ice-to-steam, the phase changes carrying the load; LEO reentry carries ~30 MJ per kg of ship but only ~1-2% couples into the skin (the shock wave takes the rest); a few tonnes of water drinks a shuttle-class V2's whole absorbed load — and the pod is 27 m3 of margin. 'Cost wise covered and then some' — graded TRUE.</w:t>
+        <w:t>S4 — THE NUMBERS: ~2.7-3 MJ/kg ice-to-steam, the phase changes carrying the load; LEO reentry carries ~30 MJ per kg of ship but only ~1-2% couples into the skin (the shock wave takes the rest); a few tonnes of water drinks the whole absorbed load of our own pod class — we are not close to shuttle weight — and the pod is 27 m3 of margin. 'Cost wise covered and then some' — graded TRUE.</w:t>
       </w:r>
     </w:p>
     <w:p>

</xml_diff>